<commit_message>
Add source video and slides
</commit_message>
<xml_diff>
--- a/tech_blog_output/dspark_speculative_decoding/final/blog.docx
+++ b/tech_blog_output/dspark_speculative_decoding/final/blog.docx
@@ -78,7 +78,7 @@
           <w:color w:val="626B75"/>
           <w:sz w:val="20"/>
         </w:rPr>
-        <w:t>2026-08-02</w:t>
+        <w:t>2026-08-05</w:t>
       </w:r>
       <w:r>
         <w:br w:type="page"/>
@@ -88,6 +88,48 @@
       <w:pPr>
         <w:pStyle w:val="Lead"/>
       </w:pPr>
+      <w:r>
+        <w:rPr>
+          <w:b/>
+        </w:rPr>
+        <w:t>原视频</w:t>
+      </w:r>
+      <w:r>
+        <w:t>：</w:t>
+      </w:r>
+      <w:hyperlink r:id="rId11">
+        <w:r>
+          <w:rPr>
+            <w:color w:val="0563C1"/>
+            <w:u w:val="single"/>
+          </w:rPr>
+          <w:t>DSpark：投机解码详解</w:t>
+        </w:r>
+      </w:hyperlink>
+      <w:r>
+        <w:t xml:space="preserve"> · </w:t>
+      </w:r>
+      <w:r>
+        <w:rPr>
+          <w:b/>
+        </w:rPr>
+        <w:t>配套资料</w:t>
+      </w:r>
+      <w:r>
+        <w:t>：</w:t>
+      </w:r>
+      <w:hyperlink r:id="rId12">
+        <w:r>
+          <w:rPr>
+            <w:color w:val="0563C1"/>
+            <w:u w:val="single"/>
+          </w:rPr>
+          <w:t>DSpark 投机解码分享</w:t>
+        </w:r>
+      </w:hyperlink>
+    </w:p>
+    <w:p>
+      <w:pPr/>
       <w:r>
         <w:t>大模型自回归生成的核心瓶颈众所周知——每步只产出一个 token，每步都要把全部参数从显存搬到计算单元，GPU 算力大量闲置。投机解码（Speculative Decoding）通过"小模型猜、大模型验"的范式打破了这一局面，但草稿质量不够高、隐藏状态获取成本过大、集群部署链路不通等工程矛盾，使得真正落地远比算法论文描述的复杂。</w:t>
       </w:r>
@@ -169,7 +211,7 @@
         <w:spacing w:after="80" w:line="290" w:lineRule="auto"/>
         <w:numPr>
           <w:ilvl w:val="0"/>
-          <w:numId w:val="11"/>
+          <w:numId w:val="12"/>
         </w:numPr>
       </w:pPr>
       <w:r>
@@ -181,7 +223,7 @@
         <w:spacing w:after="80" w:line="290" w:lineRule="auto"/>
         <w:numPr>
           <w:ilvl w:val="0"/>
-          <w:numId w:val="11"/>
+          <w:numId w:val="12"/>
         </w:numPr>
       </w:pPr>
       <w:r>
@@ -193,7 +235,7 @@
         <w:spacing w:after="80" w:line="290" w:lineRule="auto"/>
         <w:numPr>
           <w:ilvl w:val="0"/>
-          <w:numId w:val="11"/>
+          <w:numId w:val="12"/>
         </w:numPr>
       </w:pPr>
       <w:r>
@@ -205,7 +247,7 @@
         <w:spacing w:after="80" w:line="290" w:lineRule="auto"/>
         <w:numPr>
           <w:ilvl w:val="0"/>
-          <w:numId w:val="11"/>
+          <w:numId w:val="12"/>
         </w:numPr>
       </w:pPr>
       <w:r>
@@ -436,7 +478,7 @@
                 <w:rFonts w:ascii="Calibri" w:hAnsi="Calibri" w:eastAsia="Microsoft YaHei"/>
                 <w:sz w:val="18"/>
               </w:rPr>
-              <w:t>快速生成 $k$ 个候选 token</w:t>
+              <w:t>快速生成 k 个候选 token</w:t>
             </w:r>
           </w:p>
         </w:tc>
@@ -536,7 +578,7 @@
                 <w:rFonts w:ascii="Calibri" w:hAnsi="Calibri" w:eastAsia="Microsoft YaHei"/>
                 <w:sz w:val="18"/>
               </w:rPr>
-              <w:t>一次前向传播同时对 $k$ 个位置打分</w:t>
+              <w:t>一次前向传播同时对 k 个位置打分</w:t>
             </w:r>
           </w:p>
         </w:tc>
@@ -721,7 +763,7 @@
                     <pic:cNvPicPr/>
                   </pic:nvPicPr>
                   <pic:blipFill>
-                    <a:blip r:embed="rId11"/>
+                    <a:blip r:embed="rId13"/>
                     <a:stretch>
                       <a:fillRect/>
                     </a:stretch>
@@ -741,9 +783,7 @@
       </w:r>
     </w:p>
     <w:p>
-      <w:pPr>
-        <w:pStyle w:val="Caption"/>
-      </w:pPr>
+      <w:pPr/>
       <w:r>
         <w:rPr>
           <w:i/>
@@ -762,7 +802,7 @@
         <w:spacing w:after="80" w:line="290" w:lineRule="auto"/>
         <w:numPr>
           <w:ilvl w:val="0"/>
-          <w:numId w:val="11"/>
+          <w:numId w:val="13"/>
         </w:numPr>
       </w:pPr>
       <w:r>
@@ -792,7 +832,7 @@
         <w:spacing w:after="80" w:line="290" w:lineRule="auto"/>
         <w:numPr>
           <w:ilvl w:val="0"/>
-          <w:numId w:val="11"/>
+          <w:numId w:val="13"/>
         </w:numPr>
       </w:pPr>
       <w:r>
@@ -810,7 +850,7 @@
         <w:spacing w:after="80" w:line="290" w:lineRule="auto"/>
         <w:numPr>
           <w:ilvl w:val="0"/>
-          <w:numId w:val="11"/>
+          <w:numId w:val="13"/>
         </w:numPr>
       </w:pPr>
       <w:r>
@@ -864,7 +904,7 @@
         <w:spacing w:after="80" w:line="290" w:lineRule="auto"/>
         <w:numPr>
           <w:ilvl w:val="0"/>
-          <w:numId w:val="11"/>
+          <w:numId w:val="13"/>
         </w:numPr>
       </w:pPr>
       <w:r>
@@ -894,7 +934,7 @@
         <w:spacing w:after="80" w:line="290" w:lineRule="auto"/>
         <w:numPr>
           <w:ilvl w:val="0"/>
-          <w:numId w:val="11"/>
+          <w:numId w:val="13"/>
         </w:numPr>
       </w:pPr>
       <w:r>
@@ -924,7 +964,7 @@
         <w:spacing w:after="80" w:line="290" w:lineRule="auto"/>
         <w:numPr>
           <w:ilvl w:val="0"/>
-          <w:numId w:val="11"/>
+          <w:numId w:val="13"/>
         </w:numPr>
       </w:pPr>
       <w:r>
@@ -1655,7 +1695,7 @@
                     <pic:cNvPicPr/>
                   </pic:nvPicPr>
                   <pic:blipFill>
-                    <a:blip r:embed="rId12"/>
+                    <a:blip r:embed="rId14"/>
                     <a:stretch>
                       <a:fillRect/>
                     </a:stretch>
@@ -1675,9 +1715,7 @@
       </w:r>
     </w:p>
     <w:p>
-      <w:pPr>
-        <w:pStyle w:val="Caption"/>
-      </w:pPr>
+      <w:pPr/>
       <w:r>
         <w:rPr>
           <w:i/>
@@ -2385,7 +2423,7 @@
                     <pic:cNvPicPr/>
                   </pic:nvPicPr>
                   <pic:blipFill>
-                    <a:blip r:embed="rId13"/>
+                    <a:blip r:embed="rId15"/>
                     <a:stretch>
                       <a:fillRect/>
                     </a:stretch>
@@ -2405,9 +2443,7 @@
       </w:r>
     </w:p>
     <w:p>
-      <w:pPr>
-        <w:pStyle w:val="Caption"/>
-      </w:pPr>
+      <w:pPr/>
       <w:r>
         <w:rPr>
           <w:i/>
@@ -3593,7 +3629,7 @@
                     <pic:cNvPicPr/>
                   </pic:nvPicPr>
                   <pic:blipFill>
-                    <a:blip r:embed="rId14"/>
+                    <a:blip r:embed="rId16"/>
                     <a:stretch>
                       <a:fillRect/>
                     </a:stretch>
@@ -3613,9 +3649,7 @@
       </w:r>
     </w:p>
     <w:p>
-      <w:pPr>
-        <w:pStyle w:val="Caption"/>
-      </w:pPr>
+      <w:pPr/>
       <w:r>
         <w:rPr>
           <w:i/>
@@ -4512,7 +4546,7 @@
         <w:spacing w:after="80" w:line="290" w:lineRule="auto"/>
         <w:numPr>
           <w:ilvl w:val="0"/>
-          <w:numId w:val="11"/>
+          <w:numId w:val="14"/>
         </w:numPr>
       </w:pPr>
       <w:r>
@@ -4530,7 +4564,7 @@
         <w:spacing w:after="80" w:line="290" w:lineRule="auto"/>
         <w:numPr>
           <w:ilvl w:val="0"/>
-          <w:numId w:val="11"/>
+          <w:numId w:val="14"/>
         </w:numPr>
       </w:pPr>
       <w:r>
@@ -4548,7 +4582,7 @@
         <w:spacing w:after="80" w:line="290" w:lineRule="auto"/>
         <w:numPr>
           <w:ilvl w:val="0"/>
-          <w:numId w:val="11"/>
+          <w:numId w:val="14"/>
         </w:numPr>
       </w:pPr>
       <w:r>
@@ -4566,7 +4600,7 @@
         <w:spacing w:after="80" w:line="290" w:lineRule="auto"/>
         <w:numPr>
           <w:ilvl w:val="0"/>
-          <w:numId w:val="11"/>
+          <w:numId w:val="14"/>
         </w:numPr>
       </w:pPr>
       <w:r>
@@ -4698,7 +4732,7 @@
                     <pic:cNvPicPr/>
                   </pic:nvPicPr>
                   <pic:blipFill>
-                    <a:blip r:embed="rId15"/>
+                    <a:blip r:embed="rId17"/>
                     <a:stretch>
                       <a:fillRect/>
                     </a:stretch>
@@ -4718,9 +4752,7 @@
       </w:r>
     </w:p>
     <w:p>
-      <w:pPr>
-        <w:pStyle w:val="Caption"/>
-      </w:pPr>
+      <w:pPr/>
       <w:r>
         <w:rPr>
           <w:i/>
@@ -5198,7 +5230,7 @@
         <w:spacing w:after="80" w:line="290" w:lineRule="auto"/>
         <w:numPr>
           <w:ilvl w:val="0"/>
-          <w:numId w:val="11"/>
+          <w:numId w:val="15"/>
         </w:numPr>
       </w:pPr>
       <w:r>
@@ -5210,7 +5242,7 @@
         <w:spacing w:after="80" w:line="290" w:lineRule="auto"/>
         <w:numPr>
           <w:ilvl w:val="0"/>
-          <w:numId w:val="11"/>
+          <w:numId w:val="15"/>
         </w:numPr>
       </w:pPr>
       <w:r>
@@ -5231,7 +5263,7 @@
         <w:spacing w:after="80" w:line="290" w:lineRule="auto"/>
         <w:numPr>
           <w:ilvl w:val="0"/>
-          <w:numId w:val="11"/>
+          <w:numId w:val="15"/>
         </w:numPr>
       </w:pPr>
       <w:r>
@@ -5267,7 +5299,7 @@
         <w:spacing w:after="80" w:line="290" w:lineRule="auto"/>
         <w:numPr>
           <w:ilvl w:val="0"/>
-          <w:numId w:val="11"/>
+          <w:numId w:val="15"/>
         </w:numPr>
       </w:pPr>
       <w:r>
@@ -5755,7 +5787,7 @@
                     <pic:cNvPicPr/>
                   </pic:nvPicPr>
                   <pic:blipFill>
-                    <a:blip r:embed="rId16"/>
+                    <a:blip r:embed="rId18"/>
                     <a:stretch>
                       <a:fillRect/>
                     </a:stretch>
@@ -5775,9 +5807,7 @@
       </w:r>
     </w:p>
     <w:p>
-      <w:pPr>
-        <w:pStyle w:val="Caption"/>
-      </w:pPr>
+      <w:pPr/>
       <w:r>
         <w:rPr>
           <w:i/>
@@ -6485,7 +6515,7 @@
                     <pic:cNvPicPr/>
                   </pic:nvPicPr>
                   <pic:blipFill>
-                    <a:blip r:embed="rId17"/>
+                    <a:blip r:embed="rId19"/>
                     <a:stretch>
                       <a:fillRect/>
                     </a:stretch>
@@ -6505,9 +6535,7 @@
       </w:r>
     </w:p>
     <w:p>
-      <w:pPr>
-        <w:pStyle w:val="Caption"/>
-      </w:pPr>
+      <w:pPr/>
       <w:r>
         <w:rPr>
           <w:i/>
@@ -6636,7 +6664,7 @@
         <w:spacing w:after="80" w:line="290" w:lineRule="auto"/>
         <w:numPr>
           <w:ilvl w:val="0"/>
-          <w:numId w:val="11"/>
+          <w:numId w:val="16"/>
         </w:numPr>
       </w:pPr>
       <w:r>
@@ -6666,7 +6694,7 @@
         <w:spacing w:after="80" w:line="290" w:lineRule="auto"/>
         <w:numPr>
           <w:ilvl w:val="0"/>
-          <w:numId w:val="11"/>
+          <w:numId w:val="16"/>
         </w:numPr>
       </w:pPr>
       <w:r>
@@ -6696,7 +6724,7 @@
         <w:spacing w:after="80" w:line="290" w:lineRule="auto"/>
         <w:numPr>
           <w:ilvl w:val="0"/>
-          <w:numId w:val="11"/>
+          <w:numId w:val="16"/>
         </w:numPr>
       </w:pPr>
       <w:r>
@@ -6819,7 +6847,7 @@
                     <pic:cNvPicPr/>
                   </pic:nvPicPr>
                   <pic:blipFill>
-                    <a:blip r:embed="rId18"/>
+                    <a:blip r:embed="rId20"/>
                     <a:stretch>
                       <a:fillRect/>
                     </a:stretch>
@@ -6839,9 +6867,7 @@
       </w:r>
     </w:p>
     <w:p>
-      <w:pPr>
-        <w:pStyle w:val="Caption"/>
-      </w:pPr>
+      <w:pPr/>
       <w:r>
         <w:rPr>
           <w:i/>
@@ -7544,7 +7570,7 @@
         <w:spacing w:after="80" w:line="290" w:lineRule="auto"/>
         <w:numPr>
           <w:ilvl w:val="0"/>
-          <w:numId w:val="11"/>
+          <w:numId w:val="17"/>
         </w:numPr>
       </w:pPr>
       <w:r>
@@ -7562,7 +7588,7 @@
         <w:spacing w:after="80" w:line="290" w:lineRule="auto"/>
         <w:numPr>
           <w:ilvl w:val="0"/>
-          <w:numId w:val="11"/>
+          <w:numId w:val="17"/>
         </w:numPr>
       </w:pPr>
       <w:r>
@@ -7604,7 +7630,7 @@
         <w:spacing w:after="80" w:line="290" w:lineRule="auto"/>
         <w:numPr>
           <w:ilvl w:val="0"/>
-          <w:numId w:val="11"/>
+          <w:numId w:val="17"/>
         </w:numPr>
       </w:pPr>
       <w:r>
@@ -7783,7 +7809,7 @@
         <w:spacing w:after="80" w:line="290" w:lineRule="auto"/>
         <w:numPr>
           <w:ilvl w:val="0"/>
-          <w:numId w:val="11"/>
+          <w:numId w:val="18"/>
         </w:numPr>
       </w:pPr>
       <w:r>
@@ -7801,7 +7827,7 @@
         <w:spacing w:after="80" w:line="290" w:lineRule="auto"/>
         <w:numPr>
           <w:ilvl w:val="0"/>
-          <w:numId w:val="11"/>
+          <w:numId w:val="18"/>
         </w:numPr>
       </w:pPr>
       <w:r>
@@ -7819,7 +7845,7 @@
         <w:spacing w:after="80" w:line="290" w:lineRule="auto"/>
         <w:numPr>
           <w:ilvl w:val="0"/>
-          <w:numId w:val="11"/>
+          <w:numId w:val="18"/>
         </w:numPr>
       </w:pPr>
       <w:r>
@@ -7837,7 +7863,7 @@
         <w:spacing w:after="80" w:line="290" w:lineRule="auto"/>
         <w:numPr>
           <w:ilvl w:val="0"/>
-          <w:numId w:val="11"/>
+          <w:numId w:val="18"/>
         </w:numPr>
       </w:pPr>
       <w:r>
@@ -7855,7 +7881,7 @@
         <w:spacing w:after="80" w:line="290" w:lineRule="auto"/>
         <w:numPr>
           <w:ilvl w:val="0"/>
-          <w:numId w:val="11"/>
+          <w:numId w:val="18"/>
         </w:numPr>
       </w:pPr>
       <w:r>
@@ -7870,7 +7896,7 @@
         <w:spacing w:after="80" w:line="290" w:lineRule="auto"/>
         <w:numPr>
           <w:ilvl w:val="0"/>
-          <w:numId w:val="11"/>
+          <w:numId w:val="18"/>
         </w:numPr>
       </w:pPr>
       <w:r>
@@ -7885,7 +7911,7 @@
         <w:spacing w:after="80" w:line="290" w:lineRule="auto"/>
         <w:numPr>
           <w:ilvl w:val="0"/>
-          <w:numId w:val="11"/>
+          <w:numId w:val="18"/>
         </w:numPr>
       </w:pPr>
       <w:r>
@@ -8300,6 +8326,139 @@
   </w:abstractNum>
   <w:num w:numId="11">
     <w:abstractNumId w:val="10"/>
+  </w:num>
+  <w:abstractNum w:abstractNumId="11">
+    <w:multiLevelType w:val="singleLevel"/>
+    <w:lvl w:ilvl="0">
+      <w:start w:val="1"/>
+      <w:numFmt w:val="decimal"/>
+      <w:lvlText w:val="%1."/>
+      <w:lvlJc w:val="left"/>
+      <w:pPr>
+        <w:tabs>
+          <w:tab w:val="num" w:pos="540"/>
+        </w:tabs>
+        <w:ind w:left="540" w:hanging="279"/>
+        <w:spacing w:after="80" w:line="290" w:lineRule="auto"/>
+      </w:pPr>
+    </w:lvl>
+  </w:abstractNum>
+  <w:num w:numId="12">
+    <w:abstractNumId w:val="11"/>
+  </w:num>
+  <w:abstractNum w:abstractNumId="12">
+    <w:multiLevelType w:val="singleLevel"/>
+    <w:lvl w:ilvl="0">
+      <w:start w:val="1"/>
+      <w:numFmt w:val="decimal"/>
+      <w:lvlText w:val="%1."/>
+      <w:lvlJc w:val="left"/>
+      <w:pPr>
+        <w:tabs>
+          <w:tab w:val="num" w:pos="540"/>
+        </w:tabs>
+        <w:ind w:left="540" w:hanging="279"/>
+        <w:spacing w:after="80" w:line="290" w:lineRule="auto"/>
+      </w:pPr>
+    </w:lvl>
+  </w:abstractNum>
+  <w:num w:numId="13">
+    <w:abstractNumId w:val="12"/>
+  </w:num>
+  <w:abstractNum w:abstractNumId="13">
+    <w:multiLevelType w:val="singleLevel"/>
+    <w:lvl w:ilvl="0">
+      <w:start w:val="1"/>
+      <w:numFmt w:val="decimal"/>
+      <w:lvlText w:val="%1."/>
+      <w:lvlJc w:val="left"/>
+      <w:pPr>
+        <w:tabs>
+          <w:tab w:val="num" w:pos="540"/>
+        </w:tabs>
+        <w:ind w:left="540" w:hanging="279"/>
+        <w:spacing w:after="80" w:line="290" w:lineRule="auto"/>
+      </w:pPr>
+    </w:lvl>
+  </w:abstractNum>
+  <w:num w:numId="14">
+    <w:abstractNumId w:val="13"/>
+  </w:num>
+  <w:abstractNum w:abstractNumId="14">
+    <w:multiLevelType w:val="singleLevel"/>
+    <w:lvl w:ilvl="0">
+      <w:start w:val="1"/>
+      <w:numFmt w:val="decimal"/>
+      <w:lvlText w:val="%1."/>
+      <w:lvlJc w:val="left"/>
+      <w:pPr>
+        <w:tabs>
+          <w:tab w:val="num" w:pos="540"/>
+        </w:tabs>
+        <w:ind w:left="540" w:hanging="279"/>
+        <w:spacing w:after="80" w:line="290" w:lineRule="auto"/>
+      </w:pPr>
+    </w:lvl>
+  </w:abstractNum>
+  <w:num w:numId="15">
+    <w:abstractNumId w:val="14"/>
+  </w:num>
+  <w:abstractNum w:abstractNumId="15">
+    <w:multiLevelType w:val="singleLevel"/>
+    <w:lvl w:ilvl="0">
+      <w:start w:val="1"/>
+      <w:numFmt w:val="decimal"/>
+      <w:lvlText w:val="%1."/>
+      <w:lvlJc w:val="left"/>
+      <w:pPr>
+        <w:tabs>
+          <w:tab w:val="num" w:pos="540"/>
+        </w:tabs>
+        <w:ind w:left="540" w:hanging="279"/>
+        <w:spacing w:after="80" w:line="290" w:lineRule="auto"/>
+      </w:pPr>
+    </w:lvl>
+  </w:abstractNum>
+  <w:num w:numId="16">
+    <w:abstractNumId w:val="15"/>
+  </w:num>
+  <w:abstractNum w:abstractNumId="16">
+    <w:multiLevelType w:val="singleLevel"/>
+    <w:lvl w:ilvl="0">
+      <w:start w:val="1"/>
+      <w:numFmt w:val="decimal"/>
+      <w:lvlText w:val="%1."/>
+      <w:lvlJc w:val="left"/>
+      <w:pPr>
+        <w:tabs>
+          <w:tab w:val="num" w:pos="540"/>
+        </w:tabs>
+        <w:ind w:left="540" w:hanging="279"/>
+        <w:spacing w:after="80" w:line="290" w:lineRule="auto"/>
+      </w:pPr>
+    </w:lvl>
+  </w:abstractNum>
+  <w:num w:numId="17">
+    <w:abstractNumId w:val="16"/>
+  </w:num>
+  <w:abstractNum w:abstractNumId="17">
+    <w:multiLevelType w:val="singleLevel"/>
+    <w:lvl w:ilvl="0">
+      <w:start w:val="1"/>
+      <w:numFmt w:val="decimal"/>
+      <w:lvlText w:val="%1."/>
+      <w:lvlJc w:val="left"/>
+      <w:pPr>
+        <w:tabs>
+          <w:tab w:val="num" w:pos="540"/>
+        </w:tabs>
+        <w:ind w:left="540" w:hanging="279"/>
+        <w:spacing w:after="80" w:line="290" w:lineRule="auto"/>
+      </w:pPr>
+    </w:lvl>
+  </w:abstractNum>
+  <w:num w:numId="18">
+    <w:abstractNumId w:val="17"/>
   </w:num>
 </w:numbering>
 </file>
@@ -20170,6 +20329,20 @@
       <w:rFonts w:ascii="Calibri" w:hAnsi="Calibri" w:eastAsia="Microsoft YaHei"/>
       <w:color w:val="203748"/>
       <w:sz w:val="24"/>
+    </w:rPr>
+  </w:style>
+  <w:style w:type="paragraph" w:customStyle="1" w:styleId="Formula">
+    <w:name w:val="Formula"/>
+    <w:pPr>
+      <w:keepLines/>
+      <w:spacing w:before="100" w:after="200"/>
+      <w:jc w:val="center"/>
+    </w:pPr>
+    <w:rPr>
+      <w:rFonts w:ascii="Calibri" w:hAnsi="Calibri" w:eastAsia="Microsoft YaHei"/>
+      <w:b/>
+      <w:color w:val="203748"/>
+      <w:sz w:val="21"/>
     </w:rPr>
   </w:style>
 </w:styles>

</xml_diff>